<commit_message>
IVT - [DOC] 52540: cap nhat trang thai build Kidney/YHCT va cach build bang ReferencePath
Kidney va YHCT da build sach bang $env:ReferencePath tro vao
E:\IVT TEST\histest\x64\ReferencedAssemblies (MSBuild uu tien ReferencePath truoc HintPath),
khong sua csproj. Bo sung muc 14.5 (cach deploy 14 file) va 14.6 (cach build 2 plugin
co HintPath hong) vao tai lieu ky thuat.

Co-Authored-By: Claude Opus 5 (1M context) <noreply@anthropic.com>
</commit_message>
<xml_diff>
--- a/docs/52540_B_KyThuat_KiemTraTuongTacThuocGiuaCacDon_MIMS.docx
+++ b/docs/52540_B_KyThuat_KiemTraTuongTacThuocGiuaCacDon_MIMS.docx
@@ -23907,15 +23907,15 @@
                 <w:b/>
                 <w:sz w:val="18"/>
               </w:rPr>
-              <w:t>Chưa build được tại máy dev</w:t>
-            </w:r>
-            <w:r>
-              <w:rPr>
-                <w:rFonts w:ascii="Segoe UI" w:hAnsi="Segoe UI"/>
-                <w:b w:val="0"/>
-                <w:sz w:val="18"/>
-              </w:rPr>
-              <w:t xml:space="preserve"> — 20 lỗi thiếu assembly, HintPath trỏ ổ </w:t>
+              <w:t>Build sạch</w:t>
+            </w:r>
+            <w:r>
+              <w:rPr>
+                <w:rFonts w:ascii="Segoe UI" w:hAnsi="Segoe UI"/>
+                <w:b w:val="0"/>
+                <w:sz w:val="18"/>
+              </w:rPr>
+              <w:t xml:space="preserve"> — phải build bằng </w:t>
             </w:r>
             <w:r>
               <w:rPr>
@@ -23924,15 +23924,15 @@
                 <w:color w:val="A31515"/>
                 <w:sz w:val="16"/>
               </w:rPr>
-              <w:t>F:</w:t>
-            </w:r>
-            <w:r>
-              <w:rPr>
-                <w:rFonts w:ascii="Segoe UI" w:hAnsi="Segoe UI"/>
-                <w:b w:val="0"/>
-                <w:sz w:val="18"/>
-              </w:rPr>
-              <w:t xml:space="preserve"> của máy dev khác (</w:t>
+              <w:t>ReferencePath</w:t>
+            </w:r>
+            <w:r>
+              <w:rPr>
+                <w:rFonts w:ascii="Segoe UI" w:hAnsi="Segoe UI"/>
+                <w:b w:val="0"/>
+                <w:sz w:val="18"/>
+              </w:rPr>
+              <w:t xml:space="preserve"> (mục 14.6) vì csproj còn HintPath trỏ ổ </w:t>
             </w:r>
             <w:r>
               <w:rPr>
@@ -23941,15 +23941,15 @@
                 <w:color w:val="A31515"/>
                 <w:sz w:val="16"/>
               </w:rPr>
-              <w:t>HIS.UC.Icd</w:t>
-            </w:r>
-            <w:r>
-              <w:rPr>
-                <w:rFonts w:ascii="Segoe UI" w:hAnsi="Segoe UI"/>
-                <w:b w:val="0"/>
-                <w:sz w:val="18"/>
-              </w:rPr>
-              <w:t xml:space="preserve">, </w:t>
+              <w:t>F:</w:t>
+            </w:r>
+            <w:r>
+              <w:rPr>
+                <w:rFonts w:ascii="Segoe UI" w:hAnsi="Segoe UI"/>
+                <w:b w:val="0"/>
+                <w:sz w:val="18"/>
+              </w:rPr>
+              <w:t xml:space="preserve"> của máy dev khác (</w:t>
             </w:r>
             <w:r>
               <w:rPr>
@@ -23958,7 +23958,7 @@
                 <w:color w:val="A31515"/>
                 <w:sz w:val="16"/>
               </w:rPr>
-              <w:t>HIS.UC.DateEditor</w:t>
+              <w:t>HIS.UC.Icd</w:t>
             </w:r>
             <w:r>
               <w:rPr>
@@ -23975,7 +23975,7 @@
                 <w:color w:val="A31515"/>
                 <w:sz w:val="16"/>
               </w:rPr>
-              <w:t>HIS.UC.PeriousExpMestList</w:t>
+              <w:t>HIS.UC.DateEditor</w:t>
             </w:r>
             <w:r>
               <w:rPr>
@@ -23992,6 +23992,23 @@
                 <w:color w:val="A31515"/>
                 <w:sz w:val="16"/>
               </w:rPr>
+              <w:t>HIS.UC.PeriousExpMestList</w:t>
+            </w:r>
+            <w:r>
+              <w:rPr>
+                <w:rFonts w:ascii="Segoe UI" w:hAnsi="Segoe UI"/>
+                <w:b w:val="0"/>
+                <w:sz w:val="18"/>
+              </w:rPr>
+              <w:t xml:space="preserve">, </w:t>
+            </w:r>
+            <w:r>
+              <w:rPr>
+                <w:rFonts w:ascii="Consolas" w:hAnsi="Consolas"/>
+                <w:b w:val="0"/>
+                <w:color w:val="A31515"/>
+                <w:sz w:val="16"/>
+              </w:rPr>
               <w:t>Library.*</w:t>
             </w:r>
             <w:r>
@@ -24000,23 +24017,7 @@
                 <w:b w:val="0"/>
                 <w:sz w:val="18"/>
               </w:rPr>
-              <w:t xml:space="preserve">). Lỗi có từ trước, </w:t>
-            </w:r>
-            <w:r>
-              <w:rPr>
-                <w:rFonts w:ascii="Segoe UI" w:hAnsi="Segoe UI"/>
-                <w:b/>
-                <w:sz w:val="18"/>
-              </w:rPr>
-              <w:t>không</w:t>
-            </w:r>
-            <w:r>
-              <w:rPr>
-                <w:rFonts w:ascii="Segoe UI" w:hAnsi="Segoe UI"/>
-                <w:b w:val="0"/>
-                <w:sz w:val="18"/>
-              </w:rPr>
-              <w:t xml:space="preserve"> nằm ở file nào của việc 52540</w:t>
+              <w:t>)</w:t>
             </w:r>
           </w:p>
         </w:tc>
@@ -24057,15 +24058,15 @@
                 <w:b/>
                 <w:sz w:val="18"/>
               </w:rPr>
-              <w:t>Chưa build được tại máy dev</w:t>
-            </w:r>
-            <w:r>
-              <w:rPr>
-                <w:rFonts w:ascii="Segoe UI" w:hAnsi="Segoe UI"/>
-                <w:b w:val="0"/>
-                <w:sz w:val="18"/>
-              </w:rPr>
-              <w:t xml:space="preserve"> — 36 lỗi thiếu assembly (</w:t>
+              <w:t>Build sạch</w:t>
+            </w:r>
+            <w:r>
+              <w:rPr>
+                <w:rFonts w:ascii="Segoe UI" w:hAnsi="Segoe UI"/>
+                <w:b w:val="0"/>
+                <w:sz w:val="18"/>
+              </w:rPr>
+              <w:t xml:space="preserve"> — phải build bằng </w:t>
             </w:r>
             <w:r>
               <w:rPr>
@@ -24074,15 +24075,15 @@
                 <w:color w:val="A31515"/>
                 <w:sz w:val="16"/>
               </w:rPr>
-              <w:t>HIS.UC.PatientSelect</w:t>
-            </w:r>
-            <w:r>
-              <w:rPr>
-                <w:rFonts w:ascii="Segoe UI" w:hAnsi="Segoe UI"/>
-                <w:b w:val="0"/>
-                <w:sz w:val="18"/>
-              </w:rPr>
-              <w:t xml:space="preserve">, </w:t>
+              <w:t>ReferencePath</w:t>
+            </w:r>
+            <w:r>
+              <w:rPr>
+                <w:rFonts w:ascii="Segoe UI" w:hAnsi="Segoe UI"/>
+                <w:b w:val="0"/>
+                <w:sz w:val="18"/>
+              </w:rPr>
+              <w:t xml:space="preserve"> (mục 14.6) vì máy dev thiếu DLL tham chiếu (</w:t>
             </w:r>
             <w:r>
               <w:rPr>
@@ -24091,7 +24092,7 @@
                 <w:color w:val="A31515"/>
                 <w:sz w:val="16"/>
               </w:rPr>
-              <w:t>HIS.UC.TreatmentFinish</w:t>
+              <w:t>HIS.UC.PatientSelect</w:t>
             </w:r>
             <w:r>
               <w:rPr>
@@ -24108,7 +24109,7 @@
                 <w:color w:val="A31515"/>
                 <w:sz w:val="16"/>
               </w:rPr>
-              <w:t>HIS.UC.MenuPrint</w:t>
+              <w:t>HIS.UC.TreatmentFinish</w:t>
             </w:r>
             <w:r>
               <w:rPr>
@@ -24125,7 +24126,7 @@
                 <w:color w:val="A31515"/>
                 <w:sz w:val="16"/>
               </w:rPr>
-              <w:t>Library.CheckIcd</w:t>
+              <w:t>HIS.UC.MenuPrint</w:t>
             </w:r>
             <w:r>
               <w:rPr>
@@ -24142,7 +24143,7 @@
                 <w:color w:val="A31515"/>
                 <w:sz w:val="16"/>
               </w:rPr>
-              <w:t>Library.PrintServiceReq</w:t>
+              <w:t>Library.CheckIcd</w:t>
             </w:r>
             <w:r>
               <w:rPr>
@@ -24159,6 +24160,23 @@
                 <w:color w:val="A31515"/>
                 <w:sz w:val="16"/>
               </w:rPr>
+              <w:t>Library.PrintServiceReq</w:t>
+            </w:r>
+            <w:r>
+              <w:rPr>
+                <w:rFonts w:ascii="Segoe UI" w:hAnsi="Segoe UI"/>
+                <w:b w:val="0"/>
+                <w:sz w:val="18"/>
+              </w:rPr>
+              <w:t xml:space="preserve">, </w:t>
+            </w:r>
+            <w:r>
+              <w:rPr>
+                <w:rFonts w:ascii="Consolas" w:hAnsi="Consolas"/>
+                <w:b w:val="0"/>
+                <w:color w:val="A31515"/>
+                <w:sz w:val="16"/>
+              </w:rPr>
               <w:t>HIS.Desktop.LocalStorage.LocalData</w:t>
             </w:r>
             <w:r>
@@ -24167,23 +24185,7 @@
                 <w:b w:val="0"/>
                 <w:sz w:val="18"/>
               </w:rPr>
-              <w:t xml:space="preserve">). Lỗi có từ trước, </w:t>
-            </w:r>
-            <w:r>
-              <w:rPr>
-                <w:rFonts w:ascii="Segoe UI" w:hAnsi="Segoe UI"/>
-                <w:b/>
-                <w:sz w:val="18"/>
-              </w:rPr>
-              <w:t>không</w:t>
-            </w:r>
-            <w:r>
-              <w:rPr>
-                <w:rFonts w:ascii="Segoe UI" w:hAnsi="Segoe UI"/>
-                <w:b w:val="0"/>
-                <w:sz w:val="18"/>
-              </w:rPr>
-              <w:t xml:space="preserve"> nằm ở file nào của việc 52540</w:t>
+              <w:t>)</w:t>
             </w:r>
           </w:p>
         </w:tc>
@@ -24201,7 +24203,7 @@
           <w:i/>
           <w:sz w:val="20"/>
         </w:rPr>
-        <w:t xml:space="preserve">Kidney và YHCT dùng </w:t>
+        <w:t xml:space="preserve">Cả 4 plugin dùng </w:t>
       </w:r>
       <w:r>
         <w:rPr>
@@ -24256,7 +24258,7 @@
           <w:i/>
           <w:sz w:val="20"/>
         </w:rPr>
-        <w:t xml:space="preserve"> / menu chuột phải với PK và CLS (đã build sạch), tên biến đã đối chiếu trùng khớp (</w:t>
+        <w:t xml:space="preserve"> / menu chuột phải, tên biến đã đối chiếu trùng khớp (</w:t>
       </w:r>
       <w:r>
         <w:rPr>
@@ -24408,7 +24410,7 @@
           <w:i/>
           <w:sz w:val="20"/>
         </w:rPr>
-        <w:t>). Cần build lại 2 plugin này trên máy có đủ bộ DLL tham chiếu.</w:t>
+        <w:t>).</w:t>
       </w:r>
     </w:p>
     <w:p>
@@ -25616,13 +25618,12 @@
           <w:b w:val="0"/>
           <w:sz w:val="23"/>
         </w:rPr>
-        <w:t>14.5 Việc còn lại trước khi nghiệm thu</w:t>
+        <w:t>14.5 Cách deploy DLL</w:t>
       </w:r>
     </w:p>
     <w:p>
       <w:pPr>
-        <w:pStyle w:val="ListNumber"/>
-        <w:spacing w:after="40"/>
+        <w:spacing w:after="80"/>
       </w:pPr>
       <w:r>
         <w:rPr>
@@ -25630,7 +25631,41 @@
           <w:b w:val="0"/>
           <w:sz w:val="20"/>
         </w:rPr>
-        <w:t xml:space="preserve">Build lại </w:t>
+        <w:t xml:space="preserve">Repo deploy: </w:t>
+      </w:r>
+      <w:r>
+        <w:rPr>
+          <w:rFonts w:ascii="Consolas" w:hAnsi="Consolas"/>
+          <w:b w:val="0"/>
+          <w:color w:val="A31515"/>
+          <w:sz w:val="18"/>
+        </w:rPr>
+        <w:t>E:\IVT TEST\histest</w:t>
+      </w:r>
+      <w:r>
+        <w:rPr>
+          <w:rFonts w:ascii="Segoe UI" w:hAnsi="Segoe UI"/>
+          <w:b w:val="0"/>
+          <w:sz w:val="20"/>
+        </w:rPr>
+        <w:t xml:space="preserve"> (</w:t>
+      </w:r>
+      <w:r>
+        <w:rPr>
+          <w:rFonts w:ascii="Consolas" w:hAnsi="Consolas"/>
+          <w:b w:val="0"/>
+          <w:color w:val="A31515"/>
+          <w:sz w:val="18"/>
+        </w:rPr>
+        <w:t>gitlab.vietsens.vn/ivt-test/histest</w:t>
+      </w:r>
+      <w:r>
+        <w:rPr>
+          <w:rFonts w:ascii="Segoe UI" w:hAnsi="Segoe UI"/>
+          <w:b w:val="0"/>
+          <w:sz w:val="20"/>
+        </w:rPr>
+        <w:t xml:space="preserve">), branch </w:t>
       </w:r>
       <w:r>
         <w:rPr>
@@ -25638,7 +25673,7 @@
           <w:b/>
           <w:sz w:val="20"/>
         </w:rPr>
-        <w:t>Kidney</w:t>
+        <w:t>`Test`</w:t>
       </w:r>
       <w:r>
         <w:rPr>
@@ -25646,7 +25681,516 @@
           <w:b w:val="0"/>
           <w:sz w:val="20"/>
         </w:rPr>
+        <w:t xml:space="preserve"> — repo track binary.</w:t>
+      </w:r>
+    </w:p>
+    <w:p>
+      <w:pPr>
+        <w:spacing w:after="80"/>
+      </w:pPr>
+      <w:r>
+        <w:rPr>
+          <w:rFonts w:ascii="Consolas" w:hAnsi="Consolas"/>
+          <w:b w:val="0"/>
+          <w:color w:val="A31515"/>
+          <w:sz w:val="18"/>
+        </w:rPr>
+        <w:t>git pull --ff-only origin Test</w:t>
+      </w:r>
+      <w:r>
+        <w:rPr>
+          <w:rFonts w:ascii="Segoe UI" w:hAnsi="Segoe UI"/>
+          <w:b w:val="0"/>
+          <w:sz w:val="20"/>
+        </w:rPr>
+        <w:t xml:space="preserve"> TRƯỚC khi copy, sau đó commit + </w:t>
+      </w:r>
+      <w:r>
+        <w:rPr>
+          <w:rFonts w:ascii="Consolas" w:hAnsi="Consolas"/>
+          <w:b w:val="0"/>
+          <w:color w:val="A31515"/>
+          <w:sz w:val="18"/>
+        </w:rPr>
+        <w:t>git push origin Test</w:t>
+      </w:r>
+      <w:r>
+        <w:rPr>
+          <w:rFonts w:ascii="Segoe UI" w:hAnsi="Segoe UI"/>
+          <w:b w:val="0"/>
+          <w:sz w:val="20"/>
+        </w:rPr>
+        <w:t>.</w:t>
+      </w:r>
+    </w:p>
+    <w:tbl>
+      <w:tblPr>
+        <w:tblW w:type="auto" w:w="0"/>
+        <w:jc w:val="left"/>
+        <w:tblLook w:firstColumn="1" w:firstRow="1" w:lastColumn="0" w:lastRow="0" w:noHBand="0" w:noVBand="1" w:val="04A0"/>
+        <w:tblBorders>
+          <w:top w:val="single" w:sz="4" w:space="0" w:color="BFBFBF"/>
+          <w:left w:val="single" w:sz="4" w:space="0" w:color="BFBFBF"/>
+          <w:bottom w:val="single" w:sz="4" w:space="0" w:color="BFBFBF"/>
+          <w:right w:val="single" w:sz="4" w:space="0" w:color="BFBFBF"/>
+          <w:insideH w:val="single" w:sz="4" w:space="0" w:color="BFBFBF"/>
+          <w:insideV w:val="single" w:sz="4" w:space="0" w:color="BFBFBF"/>
+        </w:tblBorders>
+      </w:tblPr>
+      <w:tblGrid>
+        <w:gridCol w:w="5213"/>
+        <w:gridCol w:w="5213"/>
+      </w:tblGrid>
+      <w:tr>
+        <w:tc>
+          <w:tcPr>
+            <w:tcW w:type="dxa" w:w="5213"/>
+            <w:shd w:val="clear" w:color="auto" w:fill="E7E6E6"/>
+          </w:tcPr>
+          <w:p>
+            <w:pPr>
+              <w:spacing w:after="0"/>
+            </w:pPr>
+            <w:r/>
+            <w:r>
+              <w:rPr>
+                <w:rFonts w:ascii="Segoe UI" w:hAnsi="Segoe UI"/>
+                <w:b/>
+                <w:sz w:val="18"/>
+              </w:rPr>
+              <w:t>Đường dẫn trong repo</w:t>
+            </w:r>
+          </w:p>
+        </w:tc>
+        <w:tc>
+          <w:tcPr>
+            <w:tcW w:type="dxa" w:w="5213"/>
+            <w:shd w:val="clear" w:color="auto" w:fill="E7E6E6"/>
+          </w:tcPr>
+          <w:p>
+            <w:pPr>
+              <w:spacing w:after="0"/>
+            </w:pPr>
+            <w:r/>
+            <w:r>
+              <w:rPr>
+                <w:rFonts w:ascii="Segoe UI" w:hAnsi="Segoe UI"/>
+                <w:b/>
+                <w:sz w:val="18"/>
+              </w:rPr>
+              <w:t>File</w:t>
+            </w:r>
+          </w:p>
+        </w:tc>
+      </w:tr>
+      <w:tr>
+        <w:tc>
+          <w:tcPr>
+            <w:tcW w:type="dxa" w:w="5213"/>
+          </w:tcPr>
+          <w:p>
+            <w:pPr>
+              <w:spacing w:after="0"/>
+            </w:pPr>
+            <w:r/>
+            <w:r>
+              <w:rPr>
+                <w:rFonts w:ascii="Consolas" w:hAnsi="Consolas"/>
+                <w:b w:val="0"/>
+                <w:color w:val="A31515"/>
+                <w:sz w:val="16"/>
+              </w:rPr>
+              <w:t>x64/ReferencedAssemblies/</w:t>
+            </w:r>
+          </w:p>
+        </w:tc>
+        <w:tc>
+          <w:tcPr>
+            <w:tcW w:type="dxa" w:w="5213"/>
+          </w:tcPr>
+          <w:p>
+            <w:pPr>
+              <w:spacing w:after="0"/>
+            </w:pPr>
+            <w:r/>
+            <w:r>
+              <w:rPr>
+                <w:rFonts w:ascii="Consolas" w:hAnsi="Consolas"/>
+                <w:b w:val="0"/>
+                <w:color w:val="A31515"/>
+                <w:sz w:val="16"/>
+              </w:rPr>
+              <w:t>HIS.Desktop.MIMS.Integration.dll</w:t>
+            </w:r>
+          </w:p>
+        </w:tc>
+      </w:tr>
+      <w:tr>
+        <w:tc>
+          <w:tcPr>
+            <w:tcW w:type="dxa" w:w="5213"/>
+          </w:tcPr>
+          <w:p>
+            <w:pPr>
+              <w:spacing w:after="0"/>
+            </w:pPr>
+            <w:r/>
+            <w:r>
+              <w:rPr>
+                <w:rFonts w:ascii="Consolas" w:hAnsi="Consolas"/>
+                <w:b w:val="0"/>
+                <w:color w:val="A31515"/>
+                <w:sz w:val="16"/>
+              </w:rPr>
+              <w:t>x64/Plugins/Module/</w:t>
+            </w:r>
+          </w:p>
+        </w:tc>
+        <w:tc>
+          <w:tcPr>
+            <w:tcW w:type="dxa" w:w="5213"/>
+          </w:tcPr>
+          <w:p>
+            <w:pPr>
+              <w:spacing w:after="0"/>
+            </w:pPr>
+            <w:r/>
+            <w:r>
+              <w:rPr>
+                <w:rFonts w:ascii="Consolas" w:hAnsi="Consolas"/>
+                <w:b w:val="0"/>
+                <w:color w:val="A31515"/>
+                <w:sz w:val="16"/>
+              </w:rPr>
+              <w:t>HIS.Desktop.Plugins.AssignPrescription{PK,CLS,Kidney,YHCT}.dll</w:t>
+            </w:r>
+          </w:p>
+        </w:tc>
+      </w:tr>
+      <w:tr>
+        <w:tc>
+          <w:tcPr>
+            <w:tcW w:type="dxa" w:w="5213"/>
+          </w:tcPr>
+          <w:p>
+            <w:pPr>
+              <w:spacing w:after="0"/>
+            </w:pPr>
+            <w:r/>
+            <w:r>
+              <w:rPr>
+                <w:rFonts w:ascii="Consolas" w:hAnsi="Consolas"/>
+                <w:b w:val="0"/>
+                <w:color w:val="A31515"/>
+                <w:sz w:val="16"/>
+              </w:rPr>
+              <w:t>x64/vi/</w:t>
+            </w:r>
+            <w:r>
+              <w:rPr>
+                <w:rFonts w:ascii="Segoe UI" w:hAnsi="Segoe UI"/>
+                <w:b w:val="0"/>
+                <w:sz w:val="18"/>
+              </w:rPr>
+              <w:t xml:space="preserve">, </w:t>
+            </w:r>
+            <w:r>
+              <w:rPr>
+                <w:rFonts w:ascii="Consolas" w:hAnsi="Consolas"/>
+                <w:b w:val="0"/>
+                <w:color w:val="A31515"/>
+                <w:sz w:val="16"/>
+              </w:rPr>
+              <w:t>x64/en/</w:t>
+            </w:r>
+          </w:p>
+        </w:tc>
+        <w:tc>
+          <w:tcPr>
+            <w:tcW w:type="dxa" w:w="5213"/>
+          </w:tcPr>
+          <w:p>
+            <w:pPr>
+              <w:spacing w:after="0"/>
+            </w:pPr>
+            <w:r/>
+            <w:r>
+              <w:rPr>
+                <w:rFonts w:ascii="Consolas" w:hAnsi="Consolas"/>
+                <w:b w:val="0"/>
+                <w:color w:val="A31515"/>
+                <w:sz w:val="16"/>
+              </w:rPr>
+              <w:t>HIS.Desktop.Plugins.AssignPrescription{PK,CLS,Kidney,YHCT}.resources.dll</w:t>
+            </w:r>
+          </w:p>
+        </w:tc>
+      </w:tr>
+      <w:tr>
+        <w:tc>
+          <w:tcPr>
+            <w:tcW w:type="dxa" w:w="5213"/>
+          </w:tcPr>
+          <w:p>
+            <w:pPr>
+              <w:spacing w:after="0"/>
+            </w:pPr>
+            <w:r/>
+            <w:r>
+              <w:rPr>
+                <w:rFonts w:ascii="Consolas" w:hAnsi="Consolas"/>
+                <w:b w:val="0"/>
+                <w:color w:val="A31515"/>
+                <w:sz w:val="16"/>
+              </w:rPr>
+              <w:t>x64/my/</w:t>
+            </w:r>
+          </w:p>
+        </w:tc>
+        <w:tc>
+          <w:tcPr>
+            <w:tcW w:type="dxa" w:w="5213"/>
+          </w:tcPr>
+          <w:p>
+            <w:pPr>
+              <w:spacing w:after="0"/>
+            </w:pPr>
+            <w:r/>
+            <w:r>
+              <w:rPr>
+                <w:rFonts w:ascii="Consolas" w:hAnsi="Consolas"/>
+                <w:b w:val="0"/>
+                <w:color w:val="A31515"/>
+                <w:sz w:val="16"/>
+              </w:rPr>
+              <w:t>HIS.Desktop.Plugins.AssignPrescriptionPK.resources.dll</w:t>
+            </w:r>
+            <w:r>
+              <w:rPr>
+                <w:rFonts w:ascii="Segoe UI" w:hAnsi="Segoe UI"/>
+                <w:b w:val="0"/>
+                <w:sz w:val="18"/>
+              </w:rPr>
+              <w:t xml:space="preserve"> (chỉ PK có satellite </w:t>
+            </w:r>
+            <w:r>
+              <w:rPr>
+                <w:rFonts w:ascii="Consolas" w:hAnsi="Consolas"/>
+                <w:b w:val="0"/>
+                <w:color w:val="A31515"/>
+                <w:sz w:val="16"/>
+              </w:rPr>
+              <w:t>my</w:t>
+            </w:r>
+            <w:r>
+              <w:rPr>
+                <w:rFonts w:ascii="Segoe UI" w:hAnsi="Segoe UI"/>
+                <w:b w:val="0"/>
+                <w:sz w:val="18"/>
+              </w:rPr>
+              <w:t>)</w:t>
+            </w:r>
+          </w:p>
+        </w:tc>
+      </w:tr>
+    </w:tbl>
+    <w:p/>
+    <w:p>
+      <w:pPr>
+        <w:spacing w:after="80"/>
+      </w:pPr>
+      <w:r>
+        <w:rPr>
+          <w:rFonts w:ascii="Segoe UI" w:hAnsi="Segoe UI"/>
+          <w:b w:val="0"/>
+          <w:sz w:val="20"/>
+        </w:rPr>
+        <w:t>Tổng 14 file. Quên satellite là lệch resource với DLL chính → khối HTML "Thuốc đang dùng từ đơn khác"</w:t>
+      </w:r>
+    </w:p>
+    <w:p>
+      <w:pPr>
+        <w:spacing w:after="80"/>
+      </w:pPr>
+      <w:r>
+        <w:rPr>
+          <w:rFonts w:ascii="Segoe UI" w:hAnsi="Segoe UI"/>
+          <w:b w:val="0"/>
+          <w:sz w:val="20"/>
+        </w:rPr>
+        <w:t>rơi về chuỗi mặc định trong thư viện.</w:t>
+      </w:r>
+    </w:p>
+    <w:p>
+      <w:pPr>
+        <w:pStyle w:val="Heading2"/>
+      </w:pPr>
+      <w:r>
+        <w:rPr>
+          <w:rFonts w:ascii="Segoe UI" w:hAnsi="Segoe UI"/>
+          <w:b w:val="0"/>
+          <w:sz w:val="23"/>
+        </w:rPr>
+        <w:t>14.6 Build 2 plugin có HintPath hỏng</w:t>
+      </w:r>
+    </w:p>
+    <w:p>
+      <w:pPr>
+        <w:spacing w:after="80"/>
+      </w:pPr>
+      <w:r>
+        <w:rPr>
+          <w:rFonts w:ascii="Consolas" w:hAnsi="Consolas"/>
+          <w:b w:val="0"/>
+          <w:color w:val="A31515"/>
+          <w:sz w:val="18"/>
+        </w:rPr>
+        <w:t>AssignPrescriptionKidney</w:t>
+      </w:r>
+      <w:r>
+        <w:rPr>
+          <w:rFonts w:ascii="Segoe UI" w:hAnsi="Segoe UI"/>
+          <w:b w:val="0"/>
+          <w:sz w:val="20"/>
+        </w:rPr>
         <w:t xml:space="preserve"> và </w:t>
+      </w:r>
+      <w:r>
+        <w:rPr>
+          <w:rFonts w:ascii="Consolas" w:hAnsi="Consolas"/>
+          <w:b w:val="0"/>
+          <w:color w:val="A31515"/>
+          <w:sz w:val="18"/>
+        </w:rPr>
+        <w:t>AssignPrescriptionYHCT</w:t>
+      </w:r>
+      <w:r>
+        <w:rPr>
+          <w:rFonts w:ascii="Segoe UI" w:hAnsi="Segoe UI"/>
+          <w:b w:val="0"/>
+          <w:sz w:val="20"/>
+        </w:rPr>
+        <w:t xml:space="preserve"> có csproj trỏ HintPath sang ổ </w:t>
+      </w:r>
+      <w:r>
+        <w:rPr>
+          <w:rFonts w:ascii="Consolas" w:hAnsi="Consolas"/>
+          <w:b w:val="0"/>
+          <w:color w:val="A31515"/>
+          <w:sz w:val="18"/>
+        </w:rPr>
+        <w:t>F:</w:t>
+      </w:r>
+      <w:r>
+        <w:rPr>
+          <w:rFonts w:ascii="Segoe UI" w:hAnsi="Segoe UI"/>
+          <w:b w:val="0"/>
+          <w:sz w:val="20"/>
+        </w:rPr>
+        <w:t xml:space="preserve"> của máy dev khác.</w:t>
+      </w:r>
+    </w:p>
+    <w:p>
+      <w:pPr>
+        <w:spacing w:after="80"/>
+      </w:pPr>
+      <w:r>
+        <w:rPr>
+          <w:rFonts w:ascii="Segoe UI" w:hAnsi="Segoe UI"/>
+          <w:b w:val="0"/>
+          <w:sz w:val="20"/>
+        </w:rPr>
+        <w:t xml:space="preserve">Không sửa csproj — build bằng </w:t>
+      </w:r>
+      <w:r>
+        <w:rPr>
+          <w:rFonts w:ascii="Consolas" w:hAnsi="Consolas"/>
+          <w:b w:val="0"/>
+          <w:color w:val="A31515"/>
+          <w:sz w:val="18"/>
+        </w:rPr>
+        <w:t>ReferencePath</w:t>
+      </w:r>
+      <w:r>
+        <w:rPr>
+          <w:rFonts w:ascii="Segoe UI" w:hAnsi="Segoe UI"/>
+          <w:b w:val="0"/>
+          <w:sz w:val="20"/>
+        </w:rPr>
+        <w:t xml:space="preserve"> trỏ vào chính bộ DLL của môi trường chạy:</w:t>
+      </w:r>
+    </w:p>
+    <w:p>
+      <w:pPr>
+        <w:spacing w:after="0" w:before="0"/>
+        <w:ind w:left="144"/>
+        <w:shd w:val="clear" w:color="auto" w:fill="F4F4F4"/>
+      </w:pPr>
+      <w:r>
+        <w:rPr>
+          <w:rFonts w:ascii="Consolas" w:hAnsi="Consolas"/>
+          <w:sz w:val="17"/>
+        </w:rPr>
+        <w:t>$env:ReferencePath = "E:\IVT TEST\histest\x64\ReferencedAssemblies;E:\IVT TEST\histest\x64\Plugins\Module;E:\IVT TEST\histest\x64"</w:t>
+      </w:r>
+    </w:p>
+    <w:p>
+      <w:pPr>
+        <w:spacing w:after="0" w:before="0"/>
+        <w:ind w:left="144"/>
+        <w:shd w:val="clear" w:color="auto" w:fill="F4F4F4"/>
+      </w:pPr>
+      <w:r>
+        <w:rPr>
+          <w:rFonts w:ascii="Consolas" w:hAnsi="Consolas"/>
+          <w:sz w:val="17"/>
+        </w:rPr>
+        <w:t>msbuild HIS.Desktop.Plugins.AssignPrescriptionKidney.csproj /t:Build /p:Configuration=Debug ^</w:t>
+      </w:r>
+    </w:p>
+    <w:p>
+      <w:pPr>
+        <w:spacing w:after="0" w:before="0"/>
+        <w:ind w:left="144"/>
+        <w:shd w:val="clear" w:color="auto" w:fill="F4F4F4"/>
+      </w:pPr>
+      <w:r>
+        <w:rPr>
+          <w:rFonts w:ascii="Consolas" w:hAnsi="Consolas"/>
+          <w:sz w:val="17"/>
+        </w:rPr>
+        <w:t xml:space="preserve">        /p:TargetFrameworkVersion=v4.5.2</w:t>
+      </w:r>
+    </w:p>
+    <w:p/>
+    <w:p>
+      <w:pPr>
+        <w:spacing w:after="80"/>
+      </w:pPr>
+      <w:r>
+        <w:rPr>
+          <w:rFonts w:ascii="Segoe UI" w:hAnsi="Segoe UI"/>
+          <w:b w:val="0"/>
+          <w:sz w:val="20"/>
+        </w:rPr>
+        <w:t xml:space="preserve">MSBuild đặt </w:t>
+      </w:r>
+      <w:r>
+        <w:rPr>
+          <w:rFonts w:ascii="Consolas" w:hAnsi="Consolas"/>
+          <w:b w:val="0"/>
+          <w:color w:val="A31515"/>
+          <w:sz w:val="18"/>
+        </w:rPr>
+        <w:t>$(ReferencePath)</w:t>
+      </w:r>
+      <w:r>
+        <w:rPr>
+          <w:rFonts w:ascii="Segoe UI" w:hAnsi="Segoe UI"/>
+          <w:b w:val="0"/>
+          <w:sz w:val="20"/>
+        </w:rPr>
+        <w:t xml:space="preserve"> </w:t>
       </w:r>
       <w:r>
         <w:rPr>
@@ -25654,7 +26198,7 @@
           <w:b/>
           <w:sz w:val="20"/>
         </w:rPr>
-        <w:t>YHCT</w:t>
+        <w:t>trước</w:t>
       </w:r>
       <w:r>
         <w:rPr>
@@ -25662,7 +26206,229 @@
           <w:b w:val="0"/>
           <w:sz w:val="20"/>
         </w:rPr>
-        <w:t xml:space="preserve"> trên máy có đủ DLL tham chiếu (mục 14.3).</w:t>
+        <w:t xml:space="preserve"> </w:t>
+      </w:r>
+      <w:r>
+        <w:rPr>
+          <w:rFonts w:ascii="Consolas" w:hAnsi="Consolas"/>
+          <w:b w:val="0"/>
+          <w:color w:val="A31515"/>
+          <w:sz w:val="18"/>
+        </w:rPr>
+        <w:t>{HintPathFromItem}</w:t>
+      </w:r>
+      <w:r>
+        <w:rPr>
+          <w:rFonts w:ascii="Segoe UI" w:hAnsi="Segoe UI"/>
+          <w:b w:val="0"/>
+          <w:sz w:val="20"/>
+        </w:rPr>
+        <w:t xml:space="preserve"> trong </w:t>
+      </w:r>
+      <w:r>
+        <w:rPr>
+          <w:rFonts w:ascii="Consolas" w:hAnsi="Consolas"/>
+          <w:b w:val="0"/>
+          <w:color w:val="A31515"/>
+          <w:sz w:val="18"/>
+        </w:rPr>
+        <w:t>AssemblySearchPaths</w:t>
+      </w:r>
+      <w:r>
+        <w:rPr>
+          <w:rFonts w:ascii="Segoe UI" w:hAnsi="Segoe UI"/>
+          <w:b w:val="0"/>
+          <w:sz w:val="20"/>
+        </w:rPr>
+        <w:t>, nên các HintPath</w:t>
+      </w:r>
+    </w:p>
+    <w:p>
+      <w:pPr>
+        <w:spacing w:after="80"/>
+      </w:pPr>
+      <w:r>
+        <w:rPr>
+          <w:rFonts w:ascii="Segoe UI" w:hAnsi="Segoe UI"/>
+          <w:b w:val="0"/>
+          <w:sz w:val="20"/>
+        </w:rPr>
+        <w:t xml:space="preserve">hỏng được bỏ qua và assembly lấy từ bộ deploy. Truyền qua </w:t>
+      </w:r>
+      <w:r>
+        <w:rPr>
+          <w:rFonts w:ascii="Segoe UI" w:hAnsi="Segoe UI"/>
+          <w:b/>
+          <w:sz w:val="20"/>
+        </w:rPr>
+        <w:t>biến môi trường</w:t>
+      </w:r>
+      <w:r>
+        <w:rPr>
+          <w:rFonts w:ascii="Segoe UI" w:hAnsi="Segoe UI"/>
+          <w:b w:val="0"/>
+          <w:sz w:val="20"/>
+        </w:rPr>
+        <w:t xml:space="preserve">, không dùng </w:t>
+      </w:r>
+      <w:r>
+        <w:rPr>
+          <w:rFonts w:ascii="Consolas" w:hAnsi="Consolas"/>
+          <w:b w:val="0"/>
+          <w:color w:val="A31515"/>
+          <w:sz w:val="18"/>
+        </w:rPr>
+        <w:t>/p:ReferencePath=...</w:t>
+      </w:r>
+    </w:p>
+    <w:p>
+      <w:pPr>
+        <w:spacing w:after="80"/>
+      </w:pPr>
+      <w:r>
+        <w:rPr>
+          <w:rFonts w:ascii="Segoe UI" w:hAnsi="Segoe UI"/>
+          <w:b w:val="0"/>
+          <w:sz w:val="20"/>
+        </w:rPr>
+        <w:t xml:space="preserve">trên dòng lệnh — dấu </w:t>
+      </w:r>
+      <w:r>
+        <w:rPr>
+          <w:rFonts w:ascii="Consolas" w:hAnsi="Consolas"/>
+          <w:b w:val="0"/>
+          <w:color w:val="A31515"/>
+          <w:sz w:val="18"/>
+        </w:rPr>
+        <w:t>;</w:t>
+      </w:r>
+      <w:r>
+        <w:rPr>
+          <w:rFonts w:ascii="Segoe UI" w:hAnsi="Segoe UI"/>
+          <w:b w:val="0"/>
+          <w:sz w:val="20"/>
+        </w:rPr>
+        <w:t xml:space="preserve"> làm MSBuild báo </w:t>
+      </w:r>
+      <w:r>
+        <w:rPr>
+          <w:rFonts w:ascii="Consolas" w:hAnsi="Consolas"/>
+          <w:b w:val="0"/>
+          <w:color w:val="A31515"/>
+          <w:sz w:val="18"/>
+        </w:rPr>
+        <w:t>MSB1006: Property is not valid</w:t>
+      </w:r>
+      <w:r>
+        <w:rPr>
+          <w:rFonts w:ascii="Segoe UI" w:hAnsi="Segoe UI"/>
+          <w:b w:val="0"/>
+          <w:sz w:val="20"/>
+        </w:rPr>
+        <w:t>.</w:t>
+      </w:r>
+    </w:p>
+    <w:p>
+      <w:pPr>
+        <w:spacing w:after="80"/>
+      </w:pPr>
+      <w:r>
+        <w:rPr>
+          <w:rFonts w:ascii="Segoe UI" w:hAnsi="Segoe UI"/>
+          <w:b w:val="0"/>
+          <w:sz w:val="20"/>
+        </w:rPr>
+        <w:t xml:space="preserve">Hệ quả cần biết: cách này build </w:t>
+      </w:r>
+      <w:r>
+        <w:rPr>
+          <w:rFonts w:ascii="Segoe UI" w:hAnsi="Segoe UI"/>
+          <w:b/>
+          <w:sz w:val="20"/>
+        </w:rPr>
+        <w:t>toàn bộ</w:t>
+      </w:r>
+      <w:r>
+        <w:rPr>
+          <w:rFonts w:ascii="Segoe UI" w:hAnsi="Segoe UI"/>
+          <w:b w:val="0"/>
+          <w:sz w:val="20"/>
+        </w:rPr>
+        <w:t xml:space="preserve"> reference theo bộ deploy (kể cả DevExpress, </w:t>
+      </w:r>
+      <w:r>
+        <w:rPr>
+          <w:rFonts w:ascii="Consolas" w:hAnsi="Consolas"/>
+          <w:b w:val="0"/>
+          <w:color w:val="A31515"/>
+          <w:sz w:val="18"/>
+        </w:rPr>
+        <w:t>MOS.EFMODEL</w:t>
+      </w:r>
+      <w:r>
+        <w:rPr>
+          <w:rFonts w:ascii="Segoe UI" w:hAnsi="Segoe UI"/>
+          <w:b w:val="0"/>
+          <w:sz w:val="20"/>
+        </w:rPr>
+        <w:t>),</w:t>
+      </w:r>
+    </w:p>
+    <w:p>
+      <w:pPr>
+        <w:spacing w:after="80"/>
+      </w:pPr>
+      <w:r>
+        <w:rPr>
+          <w:rFonts w:ascii="Segoe UI" w:hAnsi="Segoe UI"/>
+          <w:b w:val="0"/>
+          <w:sz w:val="20"/>
+        </w:rPr>
+        <w:t xml:space="preserve">tức là đúng bộ đang chạy thật — không phải bộ trong </w:t>
+      </w:r>
+      <w:r>
+        <w:rPr>
+          <w:rFonts w:ascii="Consolas" w:hAnsi="Consolas"/>
+          <w:b w:val="0"/>
+          <w:color w:val="A31515"/>
+          <w:sz w:val="18"/>
+        </w:rPr>
+        <w:t>lib/</w:t>
+      </w:r>
+      <w:r>
+        <w:rPr>
+          <w:rFonts w:ascii="Segoe UI" w:hAnsi="Segoe UI"/>
+          <w:b w:val="0"/>
+          <w:sz w:val="20"/>
+        </w:rPr>
+        <w:t xml:space="preserve"> của máy dev.</w:t>
+      </w:r>
+    </w:p>
+    <w:p>
+      <w:pPr>
+        <w:pStyle w:val="Heading2"/>
+      </w:pPr>
+      <w:r>
+        <w:rPr>
+          <w:rFonts w:ascii="Segoe UI" w:hAnsi="Segoe UI"/>
+          <w:b w:val="0"/>
+          <w:sz w:val="23"/>
+        </w:rPr>
+        <w:t>14.7 Việc còn lại trước khi nghiệm thu</w:t>
+      </w:r>
+    </w:p>
+    <w:p>
+      <w:pPr>
+        <w:pStyle w:val="ListNumber"/>
+        <w:spacing w:after="40"/>
+      </w:pPr>
+      <w:r>
+        <w:rPr>
+          <w:rFonts w:ascii="Segoe UI" w:hAnsi="Segoe UI"/>
+          <w:b w:val="0"/>
+          <w:sz w:val="20"/>
+        </w:rPr>
+        <w:t>Đã build và deploy đủ 4 plugin + thư viện (mục 14.5, 14.6).</w:t>
       </w:r>
     </w:p>
     <w:p>

</xml_diff>